<commit_message>
docs(module05): fix tier colors in business DOCX (xám/cam/xanh lá)
Replace outdated violet/sky/green palette with current patrolTierTokens:
object=stone, person=orange, identity=green.

Co-authored-by: Duncan <Duncan882022@users.noreply.github.com>
</commit_message>
<xml_diff>
--- a/docs/module05/Module05_TaiLieu_NghiepVu.docx
+++ b/docs/module05/Module05_TaiLieu_NghiepVu.docx
@@ -88,6 +88,329 @@
           <w:sz w:val="22"/>
         </w:rPr>
         <w:t>Tier2 — Panel Camera | Heatmap + Panel Sự kiện</w:t>
+      </w:r>
+    </w:p>
+    <w:p>
+      <w:pPr>
+        <w:pStyle w:val="Heading2"/>
+      </w:pPr>
+      <w:r>
+        <w:t>Bảng màu 3 tầng nhận diện (token hiện tại)</w:t>
+      </w:r>
+    </w:p>
+    <w:p>
+      <w:r>
+        <w:rPr>
+          <w:rFonts w:ascii="Calibri" w:hAnsi="Calibri" w:eastAsia="Calibri"/>
+          <w:b w:val="0"/>
+          <w:i w:val="0"/>
+          <w:sz w:val="22"/>
+        </w:rPr>
+        <w:t>Nguồn sự thật: src/modules/module05-productivity/utils/patrolTierTokens.ts — dùng chung cho ROI live, thẻ sự kiện, chấm heatmap.</w:t>
+      </w:r>
+    </w:p>
+    <w:tbl>
+      <w:tblPr>
+        <w:tblStyle w:val="TableGrid"/>
+        <w:tblW w:type="auto" w:w="0"/>
+        <w:tblLook w:firstColumn="1" w:firstRow="1" w:lastColumn="0" w:lastRow="0" w:noHBand="0" w:noVBand="1" w:val="04A0"/>
+      </w:tblPr>
+      <w:tblGrid>
+        <w:gridCol w:w="1728"/>
+        <w:gridCol w:w="1728"/>
+        <w:gridCol w:w="1728"/>
+        <w:gridCol w:w="1728"/>
+        <w:gridCol w:w="1728"/>
+      </w:tblGrid>
+      <w:tr>
+        <w:tc>
+          <w:tcPr>
+            <w:tcW w:type="dxa" w:w="1728"/>
+            <w:shd w:fill="D9E2F3" w:val="clear"/>
+          </w:tcPr>
+          <w:p>
+            <w:r>
+              <w:rPr>
+                <w:b/>
+                <w:sz w:val="20"/>
+              </w:rPr>
+              <w:t>Tier</w:t>
+            </w:r>
+          </w:p>
+        </w:tc>
+        <w:tc>
+          <w:tcPr>
+            <w:tcW w:type="dxa" w:w="1728"/>
+            <w:shd w:fill="D9E2F3" w:val="clear"/>
+          </w:tcPr>
+          <w:p>
+            <w:r>
+              <w:rPr>
+                <w:b/>
+                <w:sz w:val="20"/>
+              </w:rPr>
+              <w:t>Label</w:t>
+            </w:r>
+          </w:p>
+        </w:tc>
+        <w:tc>
+          <w:tcPr>
+            <w:tcW w:type="dxa" w:w="1728"/>
+            <w:shd w:fill="D9E2F3" w:val="clear"/>
+          </w:tcPr>
+          <w:p>
+            <w:r>
+              <w:rPr>
+                <w:b/>
+                <w:sz w:val="20"/>
+              </w:rPr>
+              <w:t>Màu UI</w:t>
+            </w:r>
+          </w:p>
+        </w:tc>
+        <w:tc>
+          <w:tcPr>
+            <w:tcW w:type="dxa" w:w="1728"/>
+            <w:shd w:fill="D9E2F3" w:val="clear"/>
+          </w:tcPr>
+          <w:p>
+            <w:r>
+              <w:rPr>
+                <w:b/>
+                <w:sz w:val="20"/>
+              </w:rPr>
+              <w:t>Hex heatmap</w:t>
+            </w:r>
+          </w:p>
+        </w:tc>
+        <w:tc>
+          <w:tcPr>
+            <w:tcW w:type="dxa" w:w="1728"/>
+            <w:shd w:fill="D9E2F3" w:val="clear"/>
+          </w:tcPr>
+          <w:p>
+            <w:r>
+              <w:rPr>
+                <w:b/>
+                <w:sz w:val="20"/>
+              </w:rPr>
+              <w:t>Ý nghĩa</w:t>
+            </w:r>
+          </w:p>
+        </w:tc>
+      </w:tr>
+      <w:tr>
+        <w:tc>
+          <w:tcPr>
+            <w:tcW w:type="dxa" w:w="1728"/>
+          </w:tcPr>
+          <w:p>
+            <w:r>
+              <w:rPr>
+                <w:sz w:val="20"/>
+              </w:rPr>
+              <w:t>object</w:t>
+            </w:r>
+          </w:p>
+        </w:tc>
+        <w:tc>
+          <w:tcPr>
+            <w:tcW w:type="dxa" w:w="1728"/>
+          </w:tcPr>
+          <w:p>
+            <w:r>
+              <w:rPr>
+                <w:sz w:val="20"/>
+              </w:rPr>
+              <w:t>Đối tượng</w:t>
+            </w:r>
+          </w:p>
+        </w:tc>
+        <w:tc>
+          <w:tcPr>
+            <w:tcW w:type="dxa" w:w="1728"/>
+          </w:tcPr>
+          <w:p>
+            <w:r>
+              <w:rPr>
+                <w:sz w:val="20"/>
+              </w:rPr>
+              <w:t>xám (stone-400)</w:t>
+            </w:r>
+          </w:p>
+        </w:tc>
+        <w:tc>
+          <w:tcPr>
+            <w:tcW w:type="dxa" w:w="1728"/>
+          </w:tcPr>
+          <w:p>
+            <w:r>
+              <w:rPr>
+                <w:sz w:val="20"/>
+              </w:rPr>
+              <w:t>#a8a29e</w:t>
+            </w:r>
+          </w:p>
+        </w:tc>
+        <w:tc>
+          <w:tcPr>
+            <w:tcW w:type="dxa" w:w="1728"/>
+          </w:tcPr>
+          <w:p>
+            <w:r>
+              <w:rPr>
+                <w:sz w:val="20"/>
+              </w:rPr>
+              <w:t>Silhouette — chưa đủ tiêu chí nhận diện</w:t>
+            </w:r>
+          </w:p>
+        </w:tc>
+      </w:tr>
+      <w:tr>
+        <w:tc>
+          <w:tcPr>
+            <w:tcW w:type="dxa" w:w="1728"/>
+          </w:tcPr>
+          <w:p>
+            <w:r>
+              <w:rPr>
+                <w:sz w:val="20"/>
+              </w:rPr>
+              <w:t>person</w:t>
+            </w:r>
+          </w:p>
+        </w:tc>
+        <w:tc>
+          <w:tcPr>
+            <w:tcW w:type="dxa" w:w="1728"/>
+          </w:tcPr>
+          <w:p>
+            <w:r>
+              <w:rPr>
+                <w:sz w:val="20"/>
+              </w:rPr>
+              <w:t>Người</w:t>
+            </w:r>
+          </w:p>
+        </w:tc>
+        <w:tc>
+          <w:tcPr>
+            <w:tcW w:type="dxa" w:w="1728"/>
+          </w:tcPr>
+          <w:p>
+            <w:r>
+              <w:rPr>
+                <w:sz w:val="20"/>
+              </w:rPr>
+              <w:t>cam (orange-400)</w:t>
+            </w:r>
+          </w:p>
+        </w:tc>
+        <w:tc>
+          <w:tcPr>
+            <w:tcW w:type="dxa" w:w="1728"/>
+          </w:tcPr>
+          <w:p>
+            <w:r>
+              <w:rPr>
+                <w:sz w:val="20"/>
+              </w:rPr>
+              <w:t>#fb923c</w:t>
+            </w:r>
+          </w:p>
+        </w:tc>
+        <w:tc>
+          <w:tcPr>
+            <w:tcW w:type="dxa" w:w="1728"/>
+          </w:tcPr>
+          <w:p>
+            <w:r>
+              <w:rPr>
+                <w:sz w:val="20"/>
+              </w:rPr>
+              <w:t>Mặt đủ rõ / hồ sơ bản nháp, re-ID</w:t>
+            </w:r>
+          </w:p>
+        </w:tc>
+      </w:tr>
+      <w:tr>
+        <w:tc>
+          <w:tcPr>
+            <w:tcW w:type="dxa" w:w="1728"/>
+          </w:tcPr>
+          <w:p>
+            <w:r>
+              <w:rPr>
+                <w:sz w:val="20"/>
+              </w:rPr>
+              <w:t>identity</w:t>
+            </w:r>
+          </w:p>
+        </w:tc>
+        <w:tc>
+          <w:tcPr>
+            <w:tcW w:type="dxa" w:w="1728"/>
+          </w:tcPr>
+          <w:p>
+            <w:r>
+              <w:rPr>
+                <w:sz w:val="20"/>
+              </w:rPr>
+              <w:t>Định danh</w:t>
+            </w:r>
+          </w:p>
+        </w:tc>
+        <w:tc>
+          <w:tcPr>
+            <w:tcW w:type="dxa" w:w="1728"/>
+          </w:tcPr>
+          <w:p>
+            <w:r>
+              <w:rPr>
+                <w:sz w:val="20"/>
+              </w:rPr>
+              <w:t>xanh lá (green-400)</w:t>
+            </w:r>
+          </w:p>
+        </w:tc>
+        <w:tc>
+          <w:tcPr>
+            <w:tcW w:type="dxa" w:w="1728"/>
+          </w:tcPr>
+          <w:p>
+            <w:r>
+              <w:rPr>
+                <w:sz w:val="20"/>
+              </w:rPr>
+              <w:t>#4ade80</w:t>
+            </w:r>
+          </w:p>
+        </w:tc>
+        <w:tc>
+          <w:tcPr>
+            <w:tcW w:type="dxa" w:w="1728"/>
+          </w:tcPr>
+          <w:p>
+            <w:r>
+              <w:rPr>
+                <w:sz w:val="20"/>
+              </w:rPr>
+              <w:t>Đã xác minh gallery / gán tên</w:t>
+            </w:r>
+          </w:p>
+        </w:tc>
+      </w:tr>
+    </w:tbl>
+    <w:p/>
+    <w:p>
+      <w:r>
+        <w:rPr>
+          <w:rFonts w:ascii="Calibri" w:hAnsi="Calibri" w:eastAsia="Calibri"/>
+          <w:b w:val="0"/>
+          <w:i/>
+          <w:sz w:val="22"/>
+        </w:rPr>
+        <w:t>Lưu ý: Palette cũ (xanh lá Đối tượng / sky Người / tím Định danh) đã bỏ — không còn dùng trong UI.</w:t>
       </w:r>
     </w:p>
     <w:p>
@@ -512,7 +835,7 @@
           <w:rFonts w:ascii="Calibri" w:hAnsi="Calibri"/>
           <w:sz w:val="22"/>
         </w:rPr>
-        <w:t>Detail khi có dữ liệu: icon tách Người (sky) và Định danh (violet).</w:t>
+        <w:t>Detail khi có dữ liệu: icon tách Người (cam) và Định danh (xanh lá).</w:t>
       </w:r>
     </w:p>
     <w:p>
@@ -780,7 +1103,7 @@
               <w:rPr>
                 <w:sz w:val="20"/>
               </w:rPr>
-              <w:t>Tổng lượt gặm (N chấm xanh)</w:t>
+              <w:t>Tổng lượt gặm (N chấm xám Đối tượng)</w:t>
             </w:r>
           </w:p>
         </w:tc>
@@ -985,7 +1308,7 @@
               <w:rPr>
                 <w:sz w:val="20"/>
               </w:rPr>
-              <w:t>green</w:t>
+              <w:t>xám (stone-400)</w:t>
             </w:r>
           </w:p>
         </w:tc>
@@ -1039,7 +1362,7 @@
               <w:rPr>
                 <w:sz w:val="20"/>
               </w:rPr>
-              <w:t>sky</w:t>
+              <w:t>cam (orange-400)</w:t>
             </w:r>
           </w:p>
         </w:tc>
@@ -1093,7 +1416,7 @@
               <w:rPr>
                 <w:sz w:val="20"/>
               </w:rPr>
-              <w:t>violet</w:t>
+              <w:t>xanh lá (green-400)</w:t>
             </w:r>
           </w:p>
         </w:tc>
@@ -1679,7 +2002,7 @@
           <w:rFonts w:ascii="Calibri" w:hAnsi="Calibri"/>
           <w:sz w:val="22"/>
         </w:rPr>
-        <w:t>Ledger lượt gặm: vẫn N lượt, N chấm xanh trên map, KPI Lượt gặp · ĐT += N.</w:t>
+        <w:t>Ledger lượt gặm: vẫn N lượt, N chấm xám trên map, KPI Lượt gặp · ĐT += N.</w:t>
       </w:r>
     </w:p>
     <w:p>
@@ -1819,7 +2142,7 @@
           <w:i w:val="0"/>
           <w:sz w:val="22"/>
         </w:rPr>
-        <w:t>Nguồn sự thật: Presences (SQLite appearances). Quy tắc vàng: Số chấm xanh = số lượt gặm, không phải số entity obj-* duy nhất hay số thẻ card.</w:t>
+        <w:t>Nguồn sự thật: Presences (SQLite appearances). Quy tắc vàng: Số chấm xám Đối tượng = số lượt gặm, không phải số entity obj-* duy nhất hay số thẻ card.</w:t>
       </w:r>
     </w:p>
     <w:tbl>
@@ -1829,15 +2152,16 @@
         <w:tblLook w:firstColumn="1" w:firstRow="1" w:lastColumn="0" w:lastRow="0" w:noHBand="0" w:noVBand="1" w:val="04A0"/>
       </w:tblPr>
       <w:tblGrid>
-        <w:gridCol w:w="2160"/>
-        <w:gridCol w:w="2160"/>
-        <w:gridCol w:w="2160"/>
-        <w:gridCol w:w="2160"/>
+        <w:gridCol w:w="1728"/>
+        <w:gridCol w:w="1728"/>
+        <w:gridCol w:w="1728"/>
+        <w:gridCol w:w="1728"/>
+        <w:gridCol w:w="1728"/>
       </w:tblGrid>
       <w:tr>
         <w:tc>
           <w:tcPr>
-            <w:tcW w:type="dxa" w:w="2160"/>
+            <w:tcW w:type="dxa" w:w="1728"/>
             <w:shd w:fill="D9E2F3" w:val="clear"/>
           </w:tcPr>
           <w:p>
@@ -1852,7 +2176,7 @@
         </w:tc>
         <w:tc>
           <w:tcPr>
-            <w:tcW w:type="dxa" w:w="2160"/>
+            <w:tcW w:type="dxa" w:w="1728"/>
             <w:shd w:fill="D9E2F3" w:val="clear"/>
           </w:tcPr>
           <w:p>
@@ -1867,7 +2191,22 @@
         </w:tc>
         <w:tc>
           <w:tcPr>
-            <w:tcW w:type="dxa" w:w="2160"/>
+            <w:tcW w:type="dxa" w:w="1728"/>
+            <w:shd w:fill="D9E2F3" w:val="clear"/>
+          </w:tcPr>
+          <w:p>
+            <w:r>
+              <w:rPr>
+                <w:b/>
+                <w:sz w:val="20"/>
+              </w:rPr>
+              <w:t>Hex</w:t>
+            </w:r>
+          </w:p>
+        </w:tc>
+        <w:tc>
+          <w:tcPr>
+            <w:tcW w:type="dxa" w:w="1728"/>
             <w:shd w:fill="D9E2F3" w:val="clear"/>
           </w:tcPr>
           <w:p>
@@ -1882,7 +2221,7 @@
         </w:tc>
         <w:tc>
           <w:tcPr>
-            <w:tcW w:type="dxa" w:w="2160"/>
+            <w:tcW w:type="dxa" w:w="1728"/>
             <w:shd w:fill="D9E2F3" w:val="clear"/>
           </w:tcPr>
           <w:p>
@@ -1899,53 +2238,66 @@
       <w:tr>
         <w:tc>
           <w:tcPr>
-            <w:tcW w:type="dxa" w:w="2160"/>
+            <w:tcW w:type="dxa" w:w="1728"/>
           </w:tcPr>
           <w:p>
             <w:r>
               <w:rPr>
                 <w:sz w:val="20"/>
               </w:rPr>
-              <w:t>Định danh</w:t>
+              <w:t>Đối tượng</w:t>
             </w:r>
           </w:p>
         </w:tc>
         <w:tc>
           <w:tcPr>
-            <w:tcW w:type="dxa" w:w="2160"/>
+            <w:tcW w:type="dxa" w:w="1728"/>
           </w:tcPr>
           <w:p>
             <w:r>
               <w:rPr>
                 <w:sz w:val="20"/>
               </w:rPr>
-              <w:t>violet</w:t>
+              <w:t>xám</w:t>
             </w:r>
           </w:p>
         </w:tc>
         <w:tc>
           <w:tcPr>
-            <w:tcW w:type="dxa" w:w="2160"/>
+            <w:tcW w:type="dxa" w:w="1728"/>
           </w:tcPr>
           <w:p>
             <w:r>
               <w:rPr>
                 <w:sz w:val="20"/>
               </w:rPr>
-              <w:t>identity_count</w:t>
+              <w:t>#a8a29e</w:t>
             </w:r>
           </w:p>
         </w:tc>
         <w:tc>
           <w:tcPr>
-            <w:tcW w:type="dxa" w:w="2160"/>
+            <w:tcW w:type="dxa" w:w="1728"/>
           </w:tcPr>
           <w:p>
             <w:r>
               <w:rPr>
                 <w:sz w:val="20"/>
               </w:rPr>
-              <w:t>NV đã verify</w:t>
+              <w:t>unassigned_observations</w:t>
+            </w:r>
+          </w:p>
+        </w:tc>
+        <w:tc>
+          <w:tcPr>
+            <w:tcW w:type="dxa" w:w="1728"/>
+          </w:tcPr>
+          <w:p>
+            <w:r>
+              <w:rPr>
+                <w:sz w:val="20"/>
+              </w:rPr>
+              <w:t>Mỗi chấm = 1 lượt gặm</w:t>
             </w:r>
           </w:p>
         </w:tc>
@@ -1953,7 +2305,7 @@
       <w:tr>
         <w:tc>
           <w:tcPr>
-            <w:tcW w:type="dxa" w:w="2160"/>
+            <w:tcW w:type="dxa" w:w="1728"/>
           </w:tcPr>
           <w:p>
             <w:r>
@@ -1966,20 +2318,33 @@
         </w:tc>
         <w:tc>
           <w:tcPr>
-            <w:tcW w:type="dxa" w:w="2160"/>
+            <w:tcW w:type="dxa" w:w="1728"/>
           </w:tcPr>
           <w:p>
             <w:r>
               <w:rPr>
                 <w:sz w:val="20"/>
               </w:rPr>
-              <w:t>sky</w:t>
+              <w:t>cam</w:t>
             </w:r>
           </w:p>
         </w:tc>
         <w:tc>
           <w:tcPr>
-            <w:tcW w:type="dxa" w:w="2160"/>
+            <w:tcW w:type="dxa" w:w="1728"/>
+          </w:tcPr>
+          <w:p>
+            <w:r>
+              <w:rPr>
+                <w:sz w:val="20"/>
+              </w:rPr>
+              <w:t>#fb923c</w:t>
+            </w:r>
+          </w:p>
+        </w:tc>
+        <w:tc>
+          <w:tcPr>
+            <w:tcW w:type="dxa" w:w="1728"/>
           </w:tcPr>
           <w:p>
             <w:r>
@@ -1992,7 +2357,7 @@
         </w:tc>
         <w:tc>
           <w:tcPr>
-            <w:tcW w:type="dxa" w:w="2160"/>
+            <w:tcW w:type="dxa" w:w="1728"/>
           </w:tcPr>
           <w:p>
             <w:r>
@@ -2007,53 +2372,66 @@
       <w:tr>
         <w:tc>
           <w:tcPr>
-            <w:tcW w:type="dxa" w:w="2160"/>
+            <w:tcW w:type="dxa" w:w="1728"/>
           </w:tcPr>
           <w:p>
             <w:r>
               <w:rPr>
                 <w:sz w:val="20"/>
               </w:rPr>
-              <w:t>Đối tượng</w:t>
+              <w:t>Định danh</w:t>
             </w:r>
           </w:p>
         </w:tc>
         <w:tc>
           <w:tcPr>
-            <w:tcW w:type="dxa" w:w="2160"/>
+            <w:tcW w:type="dxa" w:w="1728"/>
           </w:tcPr>
           <w:p>
             <w:r>
               <w:rPr>
                 <w:sz w:val="20"/>
               </w:rPr>
-              <w:t>green</w:t>
+              <w:t>xanh lá</w:t>
             </w:r>
           </w:p>
         </w:tc>
         <w:tc>
           <w:tcPr>
-            <w:tcW w:type="dxa" w:w="2160"/>
+            <w:tcW w:type="dxa" w:w="1728"/>
           </w:tcPr>
           <w:p>
             <w:r>
               <w:rPr>
                 <w:sz w:val="20"/>
               </w:rPr>
-              <w:t>unassigned_observations</w:t>
+              <w:t>#4ade80</w:t>
             </w:r>
           </w:p>
         </w:tc>
         <w:tc>
           <w:tcPr>
-            <w:tcW w:type="dxa" w:w="2160"/>
+            <w:tcW w:type="dxa" w:w="1728"/>
           </w:tcPr>
           <w:p>
             <w:r>
               <w:rPr>
                 <w:sz w:val="20"/>
               </w:rPr>
-              <w:t>Mỗi chấm = 1 lượt gặm</w:t>
+              <w:t>identity_count</w:t>
+            </w:r>
+          </w:p>
+        </w:tc>
+        <w:tc>
+          <w:tcPr>
+            <w:tcW w:type="dxa" w:w="1728"/>
+          </w:tcPr>
+          <w:p>
+            <w:r>
+              <w:rPr>
+                <w:sz w:val="20"/>
+              </w:rPr>
+              <w:t>NV đã verify</w:t>
             </w:r>
           </w:p>
         </w:tc>

</xml_diff>

<commit_message>
docs(module05): add top-down business feature list to DOCX
Co-authored-by: Duncan <Duncan882022@users.noreply.github.com>
</commit_message>
<xml_diff>
--- a/docs/module05/Module05_TaiLieu_NghiepVu.docx
+++ b/docs/module05/Module05_TaiLieu_NghiepVu.docx
@@ -32,7 +32,7 @@
           <w:color w:val="666666"/>
           <w:sz w:val="20"/>
         </w:rPr>
-        <w:t>Route: /module05  |  Cập nhật: 2026-09-16</w:t>
+        <w:t>Route: /module05  |  Cập nhật: 2026-09-16 (rev.2 — danh sách tính năng)</w:t>
       </w:r>
     </w:p>
     <w:p/>
@@ -458,6 +458,871 @@
           <w:sz w:val="22"/>
         </w:rPr>
         <w:t>Tab 「Ca」 trên heatmap (nếu có) chỉ là cửa sổ lọc thời gian, không đổi mốc ngày.</w:t>
+      </w:r>
+    </w:p>
+    <w:p>
+      <w:r>
+        <w:br w:type="page"/>
+      </w:r>
+    </w:p>
+    <w:p>
+      <w:pPr>
+        <w:pStyle w:val="Heading1"/>
+      </w:pPr>
+      <w:r>
+        <w:t>Danh sách tính năng theo bố cục màn hình (trên → dưới)</w:t>
+      </w:r>
+    </w:p>
+    <w:p>
+      <w:r>
+        <w:rPr>
+          <w:rFonts w:ascii="Calibri" w:hAnsi="Calibri" w:eastAsia="Calibri"/>
+          <w:b w:val="0"/>
+          <w:i w:val="0"/>
+          <w:sz w:val="22"/>
+        </w:rPr>
+        <w:t>Liệt kê theo thứ tự người vận hành nhìn thấy trên /module05 — từ header xuống Tier3. Mỗi mục mô tả theo góc nghiệp vụ (người dùng làm gì, hệ thống trả lời gì).</w:t>
+      </w:r>
+    </w:p>
+    <w:p>
+      <w:pPr>
+        <w:pStyle w:val="Heading2"/>
+      </w:pPr>
+      <w:r>
+        <w:t>A. Header trang</w:t>
+      </w:r>
+    </w:p>
+    <w:p>
+      <w:pPr>
+        <w:pStyle w:val="ListBullet"/>
+      </w:pPr>
+      <w:r>
+        <w:rPr>
+          <w:rFonts w:ascii="Calibri" w:hAnsi="Calibri"/>
+          <w:sz w:val="22"/>
+        </w:rPr>
+        <w:t>Tiêu đề module: Hiệu Quả Công Việc</w:t>
+      </w:r>
+    </w:p>
+    <w:p>
+      <w:pPr>
+        <w:pStyle w:val="ListBullet"/>
+      </w:pPr>
+      <w:r>
+        <w:rPr>
+          <w:rFonts w:ascii="Calibri" w:hAnsi="Calibri"/>
+          <w:sz w:val="22"/>
+        </w:rPr>
+        <w:t>Mô tả phụ: Giám sát tuần tra helmet camera &amp; mật độ lao động</w:t>
+      </w:r>
+    </w:p>
+    <w:p>
+      <w:pPr>
+        <w:pStyle w:val="Heading2"/>
+      </w:pPr>
+      <w:r>
+        <w:t>B. Tier 1 — Panel Tổng Quan (KPI)</w:t>
+      </w:r>
+    </w:p>
+    <w:p>
+      <w:r>
+        <w:rPr>
+          <w:rFonts w:ascii="Calibri" w:hAnsi="Calibri" w:eastAsia="Calibri"/>
+          <w:b/>
+          <w:i w:val="0"/>
+          <w:sz w:val="22"/>
+        </w:rPr>
+        <w:t>Thu gọn / mở rộng panel; hiển thị 4 thẻ chỉ số realtime + thống kê ngày:</w:t>
+      </w:r>
+    </w:p>
+    <w:p>
+      <w:pPr>
+        <w:pStyle w:val="ListBullet"/>
+      </w:pPr>
+      <w:r>
+        <w:rPr>
+          <w:rFonts w:ascii="Calibri" w:hAnsi="Calibri"/>
+          <w:sz w:val="22"/>
+        </w:rPr>
+        <w:t>Khu vực tuần tra — theo dõi bao nhiêu khu GPS site đã có thiết bị online đang phủ (visited/total, % phủ)</w:t>
+      </w:r>
+    </w:p>
+    <w:p>
+      <w:pPr>
+        <w:pStyle w:val="ListBullet"/>
+      </w:pPr>
+      <w:r>
+        <w:rPr>
+          <w:rFonts w:ascii="Calibri" w:hAnsi="Calibri"/>
+          <w:sz w:val="22"/>
+        </w:rPr>
+        <w:t>Nhân sự — tổng headcount ngày (Người + Định danh); chi tiết tách icon cam / xanh lá khi có dữ liệu</w:t>
+      </w:r>
+    </w:p>
+    <w:p>
+      <w:pPr>
+        <w:pStyle w:val="ListBullet"/>
+      </w:pPr>
+      <w:r>
+        <w:rPr>
+          <w:rFonts w:ascii="Calibri" w:hAnsi="Calibri"/>
+          <w:sz w:val="22"/>
+        </w:rPr>
+        <w:t>Lượt gặp · ĐT — đếm lần silhouette chưa định danh vào khung (mỗi lần = 1 lượt, không gộp người)</w:t>
+      </w:r>
+    </w:p>
+    <w:p>
+      <w:pPr>
+        <w:pStyle w:val="ListBullet"/>
+      </w:pPr>
+      <w:r>
+        <w:rPr>
+          <w:rFonts w:ascii="Calibri" w:hAnsi="Calibri"/>
+          <w:sz w:val="22"/>
+        </w:rPr>
+        <w:t>Mật độ flymap — số người/khung từ drone tầm cao (YOLO); tách biệt KPI Nhân sự</w:t>
+      </w:r>
+    </w:p>
+    <w:p>
+      <w:pPr>
+        <w:pStyle w:val="ListBullet"/>
+      </w:pPr>
+      <w:r>
+        <w:rPr>
+          <w:rFonts w:ascii="Calibri" w:hAnsi="Calibri"/>
+          <w:sz w:val="22"/>
+        </w:rPr>
+        <w:t>Trạng thái chờ: thiết bị online nhưng chưa phát hiện / chưa có dữ liệu / flycam offline</w:t>
+      </w:r>
+    </w:p>
+    <w:p>
+      <w:pPr>
+        <w:pStyle w:val="ListBullet"/>
+      </w:pPr>
+      <w:r>
+        <w:rPr>
+          <w:rFonts w:ascii="Calibri" w:hAnsi="Calibri"/>
+          <w:sz w:val="22"/>
+        </w:rPr>
+        <w:t>Peak time: detail KPI lượt gặm phản ánh giờ cao điểm (không gộp lượt)</w:t>
+      </w:r>
+    </w:p>
+    <w:p>
+      <w:pPr>
+        <w:pStyle w:val="Heading2"/>
+      </w:pPr>
+      <w:r>
+        <w:t>C. Tier 2 — Panel Camera</w:t>
+      </w:r>
+    </w:p>
+    <w:p>
+      <w:r>
+        <w:rPr>
+          <w:rFonts w:ascii="Calibri" w:hAnsi="Calibri" w:eastAsia="Calibri"/>
+          <w:b/>
+          <w:i w:val="0"/>
+          <w:sz w:val="22"/>
+        </w:rPr>
+        <w:t>Chuyển Live ↔ Playback; thu gọn panel (header hiện số luồng active khi thu gọn).</w:t>
+      </w:r>
+    </w:p>
+    <w:p>
+      <w:pPr>
+        <w:pStyle w:val="Heading3"/>
+      </w:pPr>
+      <w:r>
+        <w:t>C.1. Chế độ Live</w:t>
+      </w:r>
+    </w:p>
+    <w:p>
+      <w:pPr>
+        <w:pStyle w:val="ListBullet"/>
+      </w:pPr>
+      <w:r>
+        <w:rPr>
+          <w:rFonts w:ascii="Calibri" w:hAnsi="Calibri"/>
+          <w:sz w:val="22"/>
+        </w:rPr>
+        <w:t>Lưới 3 thiết bị: Helmet 01 (HC-01), Helmet 02 (HC-02), Drone 03 (DR-03)</w:t>
+      </w:r>
+    </w:p>
+    <w:p>
+      <w:pPr>
+        <w:pStyle w:val="ListBullet"/>
+      </w:pPr>
+      <w:r>
+        <w:rPr>
+          <w:rFonts w:ascii="Calibri" w:hAnsi="Calibri"/>
+          <w:sz w:val="22"/>
+        </w:rPr>
+        <w:t>Mặc định chọn HC-02; click tile để focus camera</w:t>
+      </w:r>
+    </w:p>
+    <w:p>
+      <w:pPr>
+        <w:pStyle w:val="ListBullet"/>
+      </w:pPr>
+      <w:r>
+        <w:rPr>
+          <w:rFonts w:ascii="Calibri" w:hAnsi="Calibri"/>
+          <w:sz w:val="22"/>
+        </w:rPr>
+        <w:t>Lọc tab Bodycam (HC-01, HC-02) / Flycam (DR-03)</w:t>
+      </w:r>
+    </w:p>
+    <w:p>
+      <w:pPr>
+        <w:pStyle w:val="ListBullet"/>
+      </w:pPr>
+      <w:r>
+        <w:rPr>
+          <w:rFonts w:ascii="Calibri" w:hAnsi="Calibri"/>
+          <w:sz w:val="22"/>
+        </w:rPr>
+        <w:t>Badge LIVE + pulse dot khi stream online; retry khi offline</w:t>
+      </w:r>
+    </w:p>
+    <w:p>
+      <w:pPr>
+        <w:pStyle w:val="ListBullet"/>
+      </w:pPr>
+      <w:r>
+        <w:rPr>
+          <w:rFonts w:ascii="Calibri" w:hAnsi="Calibri"/>
+          <w:sz w:val="22"/>
+        </w:rPr>
+        <w:t>Badge chế độ bay DR-03: Tầm cao / Tầm thấp</w:t>
+      </w:r>
+    </w:p>
+    <w:p>
+      <w:pPr>
+        <w:pStyle w:val="ListBullet"/>
+      </w:pPr>
+      <w:r>
+        <w:rPr>
+          <w:rFonts w:ascii="Calibri" w:hAnsi="Calibri"/>
+          <w:sz w:val="22"/>
+        </w:rPr>
+        <w:t>Xem luồng WHEP/HLS qua MediaMTX; poll WS live bundle (~2.5s), fallback HTTP</w:t>
+      </w:r>
+    </w:p>
+    <w:p>
+      <w:pPr>
+        <w:pStyle w:val="ListBullet"/>
+      </w:pPr>
+      <w:r>
+        <w:rPr>
+          <w:rFonts w:ascii="Calibri" w:hAnsi="Calibri"/>
+          <w:sz w:val="22"/>
+        </w:rPr>
+        <w:t>Overlay bbox người (ROI) theo tier xám / cam / xanh lá — bật/tắt trên toolbar</w:t>
+      </w:r>
+    </w:p>
+    <w:p>
+      <w:pPr>
+        <w:pStyle w:val="ListBullet"/>
+      </w:pPr>
+      <w:r>
+        <w:rPr>
+          <w:rFonts w:ascii="Calibri" w:hAnsi="Calibri"/>
+          <w:sz w:val="22"/>
+        </w:rPr>
+        <w:t>Overlay thời gian + GPS trên tile HC-02 và drone</w:t>
+      </w:r>
+    </w:p>
+    <w:p>
+      <w:pPr>
+        <w:pStyle w:val="ListBullet"/>
+      </w:pPr>
+      <w:r>
+        <w:rPr>
+          <w:rFonts w:ascii="Calibri" w:hAnsi="Calibri"/>
+          <w:sz w:val="22"/>
+        </w:rPr>
+        <w:t>HC-02 mobile bridge: coi online khi có frames dù backend báo offline</w:t>
+      </w:r>
+    </w:p>
+    <w:p>
+      <w:pPr>
+        <w:pStyle w:val="ListBullet"/>
+      </w:pPr>
+      <w:r>
+        <w:rPr>
+          <w:rFonts w:ascii="Calibri" w:hAnsi="Calibri"/>
+          <w:sz w:val="22"/>
+        </w:rPr>
+        <w:t>Phóng to tier Camera fullscreen (desktop)</w:t>
+      </w:r>
+    </w:p>
+    <w:p>
+      <w:pPr>
+        <w:pStyle w:val="ListBullet"/>
+      </w:pPr>
+      <w:r>
+        <w:rPr>
+          <w:rFonts w:ascii="Calibri" w:hAnsi="Calibri"/>
+          <w:sz w:val="22"/>
+        </w:rPr>
+        <w:t>Sidebar thumbnail camera — nhóm Bodycam / Flycam</w:t>
+      </w:r>
+    </w:p>
+    <w:p>
+      <w:pPr>
+        <w:pStyle w:val="Heading3"/>
+      </w:pPr>
+      <w:r>
+        <w:t>C.2. Chế độ Playback</w:t>
+      </w:r>
+    </w:p>
+    <w:p>
+      <w:pPr>
+        <w:pStyle w:val="ListBullet"/>
+      </w:pPr>
+      <w:r>
+        <w:rPr>
+          <w:rFonts w:ascii="Calibri" w:hAnsi="Calibri"/>
+          <w:sz w:val="22"/>
+        </w:rPr>
+        <w:t>Xem lại băng ghi MediaMTX theo ngày lịch VN (0h, retain 7 ngày)</w:t>
+      </w:r>
+    </w:p>
+    <w:p>
+      <w:pPr>
+        <w:pStyle w:val="ListBullet"/>
+      </w:pPr>
+      <w:r>
+        <w:rPr>
+          <w:rFonts w:ascii="Calibri" w:hAnsi="Calibri"/>
+          <w:sz w:val="22"/>
+        </w:rPr>
+        <w:t>Date picker đồng bộ với panel Sự kiện (patrolViewDate shared)</w:t>
+      </w:r>
+    </w:p>
+    <w:p>
+      <w:pPr>
+        <w:pStyle w:val="ListBullet"/>
+      </w:pPr>
+      <w:r>
+        <w:rPr>
+          <w:rFonts w:ascii="Calibri" w:hAnsi="Calibri"/>
+          <w:sz w:val="22"/>
+        </w:rPr>
+        <w:t>Timeline marker sự kiện — click phát clip 30 giây quanh thời điểm lockedAt</w:t>
+      </w:r>
+    </w:p>
+    <w:p>
+      <w:pPr>
+        <w:pStyle w:val="ListBullet"/>
+      </w:pPr>
+      <w:r>
+        <w:rPr>
+          <w:rFonts w:ascii="Calibri" w:hAnsi="Calibri"/>
+          <w:sz w:val="22"/>
+        </w:rPr>
+        <w:t>Click thẻ sự kiện → tự chuyển ngày playback + sync timeline</w:t>
+      </w:r>
+    </w:p>
+    <w:p>
+      <w:pPr>
+        <w:pStyle w:val="ListBullet"/>
+      </w:pPr>
+      <w:r>
+        <w:rPr>
+          <w:rFonts w:ascii="Calibri" w:hAnsi="Calibri"/>
+          <w:sz w:val="22"/>
+        </w:rPr>
+        <w:t>Lọc Bodycam / Flycam trên playback</w:t>
+      </w:r>
+    </w:p>
+    <w:p>
+      <w:pPr>
+        <w:pStyle w:val="ListBullet"/>
+      </w:pPr>
+      <w:r>
+        <w:rPr>
+          <w:rFonts w:ascii="Calibri" w:hAnsi="Calibri"/>
+          <w:sz w:val="22"/>
+        </w:rPr>
+        <w:t>Không rollover ca 06:00 (khác Module 02/03)</w:t>
+      </w:r>
+    </w:p>
+    <w:p>
+      <w:pPr>
+        <w:pStyle w:val="Heading2"/>
+      </w:pPr>
+      <w:r>
+        <w:t>D. Tier 3 trái — Panel HEATMAP / FLYMAP</w:t>
+      </w:r>
+    </w:p>
+    <w:p>
+      <w:r>
+        <w:rPr>
+          <w:rFonts w:ascii="Calibri" w:hAnsi="Calibri" w:eastAsia="Calibri"/>
+          <w:b/>
+          <w:i w:val="0"/>
+          <w:sz w:val="22"/>
+        </w:rPr>
+        <w:t>Bản đồ satellite site Cầu Sông Hốt; toggle Flymap; phóng to fullscreen.</w:t>
+      </w:r>
+    </w:p>
+    <w:p>
+      <w:pPr>
+        <w:pStyle w:val="Heading3"/>
+      </w:pPr>
+      <w:r>
+        <w:t>D.1. Chế độ HEATMAP (site)</w:t>
+      </w:r>
+    </w:p>
+    <w:p>
+      <w:pPr>
+        <w:pStyle w:val="ListBullet"/>
+      </w:pPr>
+      <w:r>
+        <w:rPr>
+          <w:rFonts w:ascii="Calibri" w:hAnsi="Calibri"/>
+          <w:sz w:val="22"/>
+        </w:rPr>
+        <w:t>Layer Khu vực — polygon ranh giới site</w:t>
+      </w:r>
+    </w:p>
+    <w:p>
+      <w:pPr>
+        <w:pStyle w:val="ListBullet"/>
+      </w:pPr>
+      <w:r>
+        <w:rPr>
+          <w:rFonts w:ascii="Calibri" w:hAnsi="Calibri"/>
+          <w:sz w:val="22"/>
+        </w:rPr>
+        <w:t>Layer Mật độ — chấm presences theo tier (xám ĐT / cam Người / xanh lá Định danh)</w:t>
+      </w:r>
+    </w:p>
+    <w:p>
+      <w:pPr>
+        <w:pStyle w:val="ListBullet"/>
+      </w:pPr>
+      <w:r>
+        <w:rPr>
+          <w:rFonts w:ascii="Calibri" w:hAnsi="Calibri"/>
+          <w:sz w:val="22"/>
+        </w:rPr>
+        <w:t>Layer Mũ — marker + lộ trình HC-01, HC-02</w:t>
+      </w:r>
+    </w:p>
+    <w:p>
+      <w:pPr>
+        <w:pStyle w:val="ListBullet"/>
+      </w:pPr>
+      <w:r>
+        <w:rPr>
+          <w:rFonts w:ascii="Calibri" w:hAnsi="Calibri"/>
+          <w:sz w:val="22"/>
+        </w:rPr>
+        <w:t>Layer Flycam — marker/route DR-03 (proximity hoặc có GPS)</w:t>
+      </w:r>
+    </w:p>
+    <w:p>
+      <w:pPr>
+        <w:pStyle w:val="ListBullet"/>
+      </w:pPr>
+      <w:r>
+        <w:rPr>
+          <w:rFonts w:ascii="Calibri" w:hAnsi="Calibri"/>
+          <w:sz w:val="22"/>
+        </w:rPr>
+        <w:t>Overlay stats góc map: đếm ĐT / Người / Định danh (đồng bộ KPI)</w:t>
+      </w:r>
+    </w:p>
+    <w:p>
+      <w:pPr>
+        <w:pStyle w:val="ListBullet"/>
+      </w:pPr>
+      <w:r>
+        <w:rPr>
+          <w:rFonts w:ascii="Calibri" w:hAnsi="Calibri"/>
+          <w:sz w:val="22"/>
+        </w:rPr>
+        <w:t>Follow GPS live HC-02 — map tự pan theo vị trí mũ</w:t>
+      </w:r>
+    </w:p>
+    <w:p>
+      <w:pPr>
+        <w:pStyle w:val="ListBullet"/>
+      </w:pPr>
+      <w:r>
+        <w:rPr>
+          <w:rFonts w:ascii="Calibri" w:hAnsi="Calibri"/>
+          <w:sz w:val="22"/>
+        </w:rPr>
+        <w:t>Click chấm → bottom sheet chi tiết đối tượng (Unknown / Verified)</w:t>
+      </w:r>
+    </w:p>
+    <w:p>
+      <w:pPr>
+        <w:pStyle w:val="ListBullet"/>
+      </w:pPr>
+      <w:r>
+        <w:rPr>
+          <w:rFonts w:ascii="Calibri" w:hAnsi="Calibri"/>
+          <w:sz w:val="22"/>
+        </w:rPr>
+        <w:t>Gán định danh thủ công từ sheet (PatrolManualIdentityPanel)</w:t>
+      </w:r>
+    </w:p>
+    <w:p>
+      <w:pPr>
+        <w:pStyle w:val="ListBullet"/>
+      </w:pPr>
+      <w:r>
+        <w:rPr>
+          <w:rFonts w:ascii="Calibri" w:hAnsi="Calibri"/>
+          <w:sz w:val="22"/>
+        </w:rPr>
+        <w:t>Dedupe 1 chấm/entity; lọc chấm DR aerial khỏi heatmap site</w:t>
+      </w:r>
+    </w:p>
+    <w:p>
+      <w:pPr>
+        <w:pStyle w:val="ListBullet"/>
+      </w:pPr>
+      <w:r>
+        <w:rPr>
+          <w:rFonts w:ascii="Calibri" w:hAnsi="Calibri"/>
+          <w:sz w:val="22"/>
+        </w:rPr>
+        <w:t>DR proximity: chấm hiện như helmet</w:t>
+      </w:r>
+    </w:p>
+    <w:p>
+      <w:pPr>
+        <w:pStyle w:val="Heading3"/>
+      </w:pPr>
+      <w:r>
+        <w:t>D.2. Chế độ FLYMAP (drone tầm cao)</w:t>
+      </w:r>
+    </w:p>
+    <w:p>
+      <w:pPr>
+        <w:pStyle w:val="ListBullet"/>
+      </w:pPr>
+      <w:r>
+        <w:rPr>
+          <w:rFonts w:ascii="Calibri" w:hAnsi="Calibri"/>
+          <w:sz w:val="22"/>
+        </w:rPr>
+        <w:t>Layer Khu vực · Mật độ · Drone</w:t>
+      </w:r>
+    </w:p>
+    <w:p>
+      <w:pPr>
+        <w:pStyle w:val="ListBullet"/>
+      </w:pPr>
+      <w:r>
+        <w:rPr>
+          <w:rFonts w:ascii="Calibri" w:hAnsi="Calibri"/>
+          <w:sz w:val="22"/>
+        </w:rPr>
+        <w:t>Chấm phát hiện một màu uniform — overlay Phát hiện: N</w:t>
+      </w:r>
+    </w:p>
+    <w:p>
+      <w:pPr>
+        <w:pStyle w:val="ListBullet"/>
+      </w:pPr>
+      <w:r>
+        <w:rPr>
+          <w:rFonts w:ascii="Calibri" w:hAnsi="Calibri"/>
+          <w:sz w:val="22"/>
+        </w:rPr>
+        <w:t>Follow GPS live DR-03</w:t>
+      </w:r>
+    </w:p>
+    <w:p>
+      <w:pPr>
+        <w:pStyle w:val="ListBullet"/>
+      </w:pPr>
+      <w:r>
+        <w:rPr>
+          <w:rFonts w:ascii="Calibri" w:hAnsi="Calibri"/>
+          <w:sz w:val="22"/>
+        </w:rPr>
+        <w:t>Route chỉ drone; không mở object sheet khi click chấm</w:t>
+      </w:r>
+    </w:p>
+    <w:p>
+      <w:pPr>
+        <w:pStyle w:val="Heading2"/>
+      </w:pPr>
+      <w:r>
+        <w:t>E. Tier 3 phải — Panel SỰ KIỆN</w:t>
+      </w:r>
+    </w:p>
+    <w:p>
+      <w:pPr>
+        <w:pStyle w:val="ListBullet"/>
+      </w:pPr>
+      <w:r>
+        <w:rPr>
+          <w:rFonts w:ascii="Calibri" w:hAnsi="Calibri"/>
+          <w:sz w:val="22"/>
+        </w:rPr>
+        <w:t>Date picker compact — 7 ngày gần nhất, đồng bộ playback/heatmap</w:t>
+      </w:r>
+    </w:p>
+    <w:p>
+      <w:pPr>
+        <w:pStyle w:val="ListBullet"/>
+      </w:pPr>
+      <w:r>
+        <w:rPr>
+          <w:rFonts w:ascii="Calibri" w:hAnsi="Calibri"/>
+          <w:sz w:val="22"/>
+        </w:rPr>
+        <w:t>Hint Đang xem ngày trước khi xem lịch sử</w:t>
+      </w:r>
+    </w:p>
+    <w:p>
+      <w:pPr>
+        <w:pStyle w:val="ListBullet"/>
+      </w:pPr>
+      <w:r>
+        <w:rPr>
+          <w:rFonts w:ascii="Calibri" w:hAnsi="Calibri"/>
+          <w:sz w:val="22"/>
+        </w:rPr>
+        <w:t>Header label chế độ flycam: Tầm thấp · AI / Tầm cao · Mật độ</w:t>
+      </w:r>
+    </w:p>
+    <w:p>
+      <w:pPr>
+        <w:pStyle w:val="ListBullet"/>
+      </w:pPr>
+      <w:r>
+        <w:rPr>
+          <w:rFonts w:ascii="Calibri" w:hAnsi="Calibri"/>
+          <w:sz w:val="22"/>
+        </w:rPr>
+        <w:t>4 tab filter: Tất cả · Đối tượng · Người · Định danh (badge count mỗi tab)</w:t>
+      </w:r>
+    </w:p>
+    <w:p>
+      <w:pPr>
+        <w:pStyle w:val="ListBullet"/>
+      </w:pPr>
+      <w:r>
+        <w:rPr>
+          <w:rFonts w:ascii="Calibri" w:hAnsi="Calibri"/>
+          <w:sz w:val="22"/>
+        </w:rPr>
+        <w:t>Tìm kiếm tên, mã NV, pers_id (debounce 300ms)</w:t>
+      </w:r>
+    </w:p>
+    <w:p>
+      <w:pPr>
+        <w:pStyle w:val="ListBullet"/>
+      </w:pPr>
+      <w:r>
+        <w:rPr>
+          <w:rFonts w:ascii="Calibri" w:hAnsi="Calibri"/>
+          <w:sz w:val="22"/>
+        </w:rPr>
+        <w:t>Thẻ sự kiện có snapshot evidence — badge tier + thời gian + vị trí camera/khu</w:t>
+      </w:r>
+    </w:p>
+    <w:p>
+      <w:pPr>
+        <w:pStyle w:val="ListBullet"/>
+      </w:pPr>
+      <w:r>
+        <w:rPr>
+          <w:rFonts w:ascii="Calibri" w:hAnsi="Calibri"/>
+          <w:sz w:val="22"/>
+        </w:rPr>
+        <w:t>Badge thăng tần (promoted) khi entity được nâng tier trong ngày</w:t>
+      </w:r>
+    </w:p>
+    <w:p>
+      <w:pPr>
+        <w:pStyle w:val="ListBullet"/>
+      </w:pPr>
+      <w:r>
+        <w:rPr>
+          <w:rFonts w:ascii="Calibri" w:hAnsi="Calibri"/>
+          <w:sz w:val="22"/>
+        </w:rPr>
+        <w:t>Hiển thị số lượt xuất hiện (≥2) cho Người / Định danh</w:t>
+      </w:r>
+    </w:p>
+    <w:p>
+      <w:pPr>
+        <w:pStyle w:val="ListBullet"/>
+      </w:pPr>
+      <w:r>
+        <w:rPr>
+          <w:rFonts w:ascii="Calibri" w:hAnsi="Calibri"/>
+          <w:sz w:val="22"/>
+        </w:rPr>
+        <w:t>Cuộn vô hạn — load thêm 4 thẻ/lần</w:t>
+      </w:r>
+    </w:p>
+    <w:p>
+      <w:pPr>
+        <w:pStyle w:val="ListBullet"/>
+      </w:pPr>
+      <w:r>
+        <w:rPr>
+          <w:rFonts w:ascii="Calibri" w:hAnsi="Calibri"/>
+          <w:sz w:val="22"/>
+        </w:rPr>
+        <w:t>Click thẻ → chọn + mở popup chi tiết + sync ngày playback</w:t>
+      </w:r>
+    </w:p>
+    <w:p>
+      <w:pPr>
+        <w:pStyle w:val="ListBullet"/>
+      </w:pPr>
+      <w:r>
+        <w:rPr>
+          <w:rFonts w:ascii="Calibri" w:hAnsi="Calibri"/>
+          <w:sz w:val="22"/>
+        </w:rPr>
+        <w:t>Lọc sự kiện person/profile từ DR-03 aerial (chỉ giữ object)</w:t>
+      </w:r>
+    </w:p>
+    <w:p>
+      <w:pPr>
+        <w:pStyle w:val="ListBullet"/>
+      </w:pPr>
+      <w:r>
+        <w:rPr>
+          <w:rFonts w:ascii="Calibri" w:hAnsi="Calibri"/>
+          <w:sz w:val="22"/>
+        </w:rPr>
+        <w:t>Peak time: thẻ nhóm 1 snapshot; ledger vẫn đếm đủ N lượt gặm</w:t>
+      </w:r>
+    </w:p>
+    <w:p>
+      <w:pPr>
+        <w:pStyle w:val="ListBullet"/>
+      </w:pPr>
+      <w:r>
+        <w:rPr>
+          <w:rFonts w:ascii="Calibri" w:hAnsi="Calibri"/>
+          <w:sz w:val="22"/>
+        </w:rPr>
+        <w:t>Empty state: chờ backend / không có sự kiện ngày</w:t>
+      </w:r>
+    </w:p>
+    <w:p>
+      <w:pPr>
+        <w:pStyle w:val="Heading2"/>
+      </w:pPr>
+      <w:r>
+        <w:t>F. Popup &amp; hành động phát sinh từ màn chính</w:t>
+      </w:r>
+    </w:p>
+    <w:p>
+      <w:pPr>
+        <w:pStyle w:val="ListBullet"/>
+      </w:pPr>
+      <w:r>
+        <w:rPr>
+          <w:rFonts w:ascii="Calibri" w:hAnsi="Calibri"/>
+          <w:sz w:val="22"/>
+        </w:rPr>
+        <w:t>PatrolEventDetailModal — snapshot lớn, tier, tên/alias, camera, GPS, thời gian</w:t>
+      </w:r>
+    </w:p>
+    <w:p>
+      <w:pPr>
+        <w:pStyle w:val="ListBullet"/>
+      </w:pPr>
+      <w:r>
+        <w:rPr>
+          <w:rFonts w:ascii="Calibri" w:hAnsi="Calibri"/>
+          <w:sz w:val="22"/>
+        </w:rPr>
+        <w:t>Lịch sử xuất hiện trong ngày (appearance segments) theo subject</w:t>
+      </w:r>
+    </w:p>
+    <w:p>
+      <w:pPr>
+        <w:pStyle w:val="ListBullet"/>
+      </w:pPr>
+      <w:r>
+        <w:rPr>
+          <w:rFonts w:ascii="Calibri" w:hAnsi="Calibri"/>
+          <w:sz w:val="22"/>
+        </w:rPr>
+        <w:t>Gallery mặt đối chiếu (khi đã định danh)</w:t>
+      </w:r>
+    </w:p>
+    <w:p>
+      <w:pPr>
+        <w:pStyle w:val="ListBullet"/>
+      </w:pPr>
+      <w:r>
+        <w:rPr>
+          <w:rFonts w:ascii="Calibri" w:hAnsi="Calibri"/>
+          <w:sz w:val="22"/>
+        </w:rPr>
+        <w:t>PatrolCameraAiConfigModal — cấu hình AI patrol_person cho HC-* / DR-*</w:t>
+      </w:r>
+    </w:p>
+    <w:p>
+      <w:pPr>
+        <w:pStyle w:val="ListBullet"/>
+      </w:pPr>
+      <w:r>
+        <w:rPr>
+          <w:rFonts w:ascii="Calibri" w:hAnsi="Calibri"/>
+          <w:sz w:val="22"/>
+        </w:rPr>
+        <w:t>PatrolDevicePermissionGate — xin quyền camera/mic (legacy mobile helmet only)</w:t>
+      </w:r>
+    </w:p>
+    <w:p>
+      <w:pPr>
+        <w:pStyle w:val="Heading2"/>
+      </w:pPr>
+      <w:r>
+        <w:t>G. Trang con liên quan (ngoài layout chính)</w:t>
+      </w:r>
+    </w:p>
+    <w:p>
+      <w:pPr>
+        <w:pStyle w:val="ListBullet"/>
+      </w:pPr>
+      <w:r>
+        <w:rPr>
+          <w:rFonts w:ascii="Calibri" w:hAnsi="Calibri"/>
+          <w:sz w:val="22"/>
+        </w:rPr>
+        <w:t>/module05/ho-so — Quản lý hồ sơ công nhân: bản nháp, xác minh, import Excel</w:t>
+      </w:r>
+    </w:p>
+    <w:p>
+      <w:pPr>
+        <w:pStyle w:val="ListBullet"/>
+      </w:pPr>
+      <w:r>
+        <w:rPr>
+          <w:rFonts w:ascii="Calibri" w:hAnsi="Calibri"/>
+          <w:sz w:val="22"/>
+        </w:rPr>
+        <w:t>/module05/quet-mat — Quét mặt bổ sung vector / tạo hồ sơ mới 3 góc</w:t>
+      </w:r>
+    </w:p>
+    <w:p>
+      <w:pPr>
+        <w:pStyle w:val="ListBullet"/>
+      </w:pPr>
+      <w:r>
+        <w:rPr>
+          <w:rFonts w:ascii="Calibri" w:hAnsi="Calibri"/>
+          <w:sz w:val="22"/>
+        </w:rPr>
+        <w:t>/module05/phat-song (publisher) — phát luồng WHIP từ thiết bị đeo mũ</w:t>
       </w:r>
     </w:p>
     <w:p>

</xml_diff>